<commit_message>
Aplica identidade visual JSO à experiência
</commit_message>
<xml_diff>
--- a/documentos/Paginas_da_Vida_Revisao_Pastoral.docx
+++ b/documentos/Paginas_da_Vida_Revisao_Pastoral.docx
@@ -4,8 +4,48 @@
   <w:body>
     <w:p>
       <w:pPr>
-        <w:spacing w:after="1800"/>
-      </w:pPr>
+        <w:spacing w:after="760"/>
+      </w:pPr>
+    </w:p>
+    <w:p>
+      <w:pPr>
+        <w:spacing w:after="560"/>
+        <w:jc w:val="center"/>
+      </w:pPr>
+      <w:r>
+        <w:drawing>
+          <wp:inline xmlns:a="http://schemas.openxmlformats.org/drawingml/2006/main" xmlns:pic="http://schemas.openxmlformats.org/drawingml/2006/picture">
+            <wp:extent cx="1325880" cy="473991"/>
+            <wp:docPr id="1" name="Picture 1"/>
+            <wp:cNvGraphicFramePr>
+              <a:graphicFrameLocks noChangeAspect="1"/>
+            </wp:cNvGraphicFramePr>
+            <a:graphic>
+              <a:graphicData uri="http://schemas.openxmlformats.org/drawingml/2006/picture">
+                <pic:pic>
+                  <pic:nvPicPr>
+                    <pic:cNvPr id="0" name="jso-logo-navy.png"/>
+                    <pic:cNvPicPr/>
+                  </pic:nvPicPr>
+                  <pic:blipFill>
+                    <a:blip r:embed="rId11"/>
+                    <a:stretch>
+                      <a:fillRect/>
+                    </a:stretch>
+                  </pic:blipFill>
+                  <pic:spPr>
+                    <a:xfrm>
+                      <a:off x="0" y="0"/>
+                      <a:ext cx="1325880" cy="473991"/>
+                    </a:xfrm>
+                    <a:prstGeom prst="rect"/>
+                  </pic:spPr>
+                </pic:pic>
+              </a:graphicData>
+            </a:graphic>
+          </wp:inline>
+        </w:drawing>
+      </w:r>
     </w:p>
     <w:p>
       <w:pPr>
@@ -20662,13 +20702,47 @@
       <w:jc w:val="left"/>
     </w:pPr>
     <w:r>
+      <w:drawing>
+        <wp:inline xmlns:a="http://schemas.openxmlformats.org/drawingml/2006/main" xmlns:pic="http://schemas.openxmlformats.org/drawingml/2006/picture">
+          <wp:extent cx="438912" cy="156907"/>
+          <wp:docPr id="1" name="Picture 1"/>
+          <wp:cNvGraphicFramePr>
+            <a:graphicFrameLocks noChangeAspect="1"/>
+          </wp:cNvGraphicFramePr>
+          <a:graphic>
+            <a:graphicData uri="http://schemas.openxmlformats.org/drawingml/2006/picture">
+              <pic:pic>
+                <pic:nvPicPr>
+                  <pic:cNvPr id="0" name="jso-logo-navy.png"/>
+                  <pic:cNvPicPr/>
+                </pic:nvPicPr>
+                <pic:blipFill>
+                  <a:blip r:embed="rId1"/>
+                  <a:stretch>
+                    <a:fillRect/>
+                  </a:stretch>
+                </pic:blipFill>
+                <pic:spPr>
+                  <a:xfrm>
+                    <a:off x="0" y="0"/>
+                    <a:ext cx="438912" cy="156907"/>
+                  </a:xfrm>
+                  <a:prstGeom prst="rect"/>
+                </pic:spPr>
+              </pic:pic>
+            </a:graphicData>
+          </a:graphic>
+        </wp:inline>
+      </w:drawing>
+    </w:r>
+    <w:r>
       <w:rPr>
         <w:rFonts w:ascii="Calibri" w:hAnsi="Calibri"/>
         <w:b/>
         <w:color w:val="9A7B45"/>
         <w:sz w:val="17"/>
       </w:rPr>
-      <w:t>PÁGINAS DA VIDA  |  JSO</w:t>
+      <w:t xml:space="preserve">   PÁGINAS DA VIDA  |  JSO</w:t>
     </w:r>
   </w:p>
 </w:hdr>

</xml_diff>